<commit_message>
feat: reformulacao estrutural para 9 aulas e enriquecimento teorico dos notebooks
</commit_message>
<xml_diff>
--- a/aulas/aula-01-kickoff/roteiro-aula-01-kickoff.docx
+++ b/aulas/aula-01-kickoff/roteiro-aula-01-kickoff.docx
@@ -62,7 +62,7 @@
           <w:color w:val="F5A623"/>
           <w:sz w:val="18"/>
         </w:rPr>
-        <w:t xml:space="preserve">  0:00 – 0:05  |  Apresentacao e contexto</w:t>
+        <w:t xml:space="preserve">  0:00 – 0:03  |  Apresentacao e contexto</w:t>
       </w:r>
     </w:p>
     <w:p>
@@ -95,7 +95,7 @@
           <w:color w:val="1A1A1A"/>
           <w:sz w:val="22"/>
         </w:rPr>
-        <w:t>Nas proximas cinco semanas — dez aulas ao todo — vamos construir juntos uma estrategia quantitativa completa. Do zero absoluto ao relatorio final, pronto para ser apresentado ao juri do Desafio Quant AI da Itau Asset Management.</w:t>
+        <w:t>Nas proximas cinco semanas — nove aulas ao todo — vamos construir juntos uma estrategia quantitativa completa. Do zero absoluto ao relatorio final, pronto para ser apresentado ao juri do Desafio Quant AI da Itau Asset Management.</w:t>
       </w:r>
     </w:p>
     <w:p>
@@ -107,7 +107,7 @@
           <w:color w:val="1A1A1A"/>
           <w:sz w:val="22"/>
         </w:rPr>
-        <w:t>O formato vai ser sempre o mesmo em cada aula: primeiro a gente passa por teoria — de 20 a 30 minutos — para entender o porque de cada decisao que vamos tomar. Depois e live coding: eu digito na frente de voces, voces replicam no computador de voces. Ao final de cada aula, voces tem um notebook funcionando que avanca a estrategia um passo.</w:t>
+        <w:t>O formato vai ser sempre o mesmo em cada aula: primeiro a gente passa por teoria — cerca de 20 minutos — para entender o porque de cada decisao que vamos tomar. Depois e live coding de 40 minutos: eu digito na frente de voces, voces replicam no computador de voces. Ao final de cada aula de 60 minutos, voces tem um notebook funcionando que avanca a estrategia um passo.</w:t>
       </w:r>
     </w:p>
     <w:p>
@@ -173,7 +173,7 @@
           <w:color w:val="F5A623"/>
           <w:sz w:val="18"/>
         </w:rPr>
-        <w:t xml:space="preserve">  0:05 – 0:20  |  Classes de ativos e seus papeis</w:t>
+        <w:t xml:space="preserve">  0:03 – 0:13  |  Classes de ativos e seus papeis</w:t>
       </w:r>
     </w:p>
     <w:p>
@@ -509,7 +509,7 @@
           <w:color w:val="F5A623"/>
           <w:sz w:val="18"/>
         </w:rPr>
-        <w:t xml:space="preserve">  0:20 – 0:35  |  MPT, CAPM e HME</w:t>
+        <w:t xml:space="preserve">  0:13 – 0:23  |  MPT, CAPM e HME</w:t>
       </w:r>
     </w:p>
     <w:p>
@@ -692,7 +692,7 @@
           <w:color w:val="F5A623"/>
           <w:sz w:val="18"/>
         </w:rPr>
-        <w:t xml:space="preserve">  0:35 – 0:55  |  Fatores, anomalias e momentum</w:t>
+        <w:t xml:space="preserve">  0:23 – 0:33  |  Fatores, anomalias e momentum</w:t>
       </w:r>
     </w:p>
     <w:p>
@@ -875,7 +875,7 @@
           <w:color w:val="F5A623"/>
           <w:sz w:val="18"/>
         </w:rPr>
-        <w:t xml:space="preserve">  0:55 – 1:20  |  A nossa tese de investimento</w:t>
+        <w:t xml:space="preserve">  0:33 – 0:43  |  A nossa tese de investimento</w:t>
       </w:r>
     </w:p>
     <w:p>
@@ -1177,7 +1177,7 @@
           <w:color w:val="F5A623"/>
           <w:sz w:val="18"/>
         </w:rPr>
-        <w:t xml:space="preserve">  1:20 – 1:40  |  Contexto da competicao e o que vamos construir</w:t>
+        <w:t xml:space="preserve">  0:43 – 0:53  |  Contexto da competicao e o que vamos construir</w:t>
       </w:r>
     </w:p>
     <w:p>
@@ -1363,7 +1363,7 @@
           <w:color w:val="1A6EAE"/>
           <w:sz w:val="26"/>
         </w:rPr>
-        <w:t>Roadmap das 10 Aulas</w:t>
+        <w:t>Roadmap das 9 Aulas</w:t>
       </w:r>
     </w:p>
     <w:p>
@@ -1375,7 +1375,7 @@
           <w:color w:val="1A1A1A"/>
           <w:sz w:val="22"/>
         </w:rPr>
-        <w:t>Aqui esta o mapa do que vamos construir. Aula 1 e hoje — fundamentos. Aula 2: coleta e limpeza de dados. Aula 3: analise exploratoria. Aula 4: construir o sinal v1. Aula 5: primeiro backtest completo. Aula 6: esquemas de alocacao. Aula 7: sinal v2 ajustado por volatilidade. Aula 8: backtest rigoroso — a aula mais importante para o juri. Aula 9: usar GenAI para acelerar a analise. Aula 10: relatorio final e preparacao para a defesa.</w:t>
+        <w:t>Aqui esta o mapa do que vamos construir. Aula 1 e hoje — fundamentos. Aula 2: coleta e limpeza de dados. Aula 3: analise exploratoria. Aula 4: construir o sinal v1. Aula 5: primeiro backtest completo. Aula 6: esquemas de alocacao. Aula 7: sinal v2 ajustado por volatilidade. Aula 8: backtest rigoroso — a aula mais importante para o juri. Aula 9: GenAI, relatorio final e preparacao para a defesa.</w:t>
       </w:r>
     </w:p>
     <w:p>
@@ -1419,7 +1419,7 @@
           <w:color w:val="F5A623"/>
           <w:sz w:val="18"/>
         </w:rPr>
-        <w:t xml:space="preserve">  1:40 – 2:00  |  Configurar ambiente, explorar estrutura do projeto</w:t>
+        <w:t xml:space="preserve">  0:53 – 0:57  |  Configurar ambiente, explorar estrutura do projeto</w:t>
       </w:r>
     </w:p>
     <w:p>
@@ -1664,7 +1664,7 @@
           <w:color w:val="F5A623"/>
           <w:sz w:val="18"/>
         </w:rPr>
-        <w:t xml:space="preserve">  1:55 – 2:00</w:t>
+        <w:t xml:space="preserve">  0:57 – 1:00</w:t>
       </w:r>
     </w:p>
     <w:p>

</xml_diff>